<commit_message>
atulização da aula 28/09/2026
</commit_message>
<xml_diff>
--- a/apostila/Projeto Space for me3.docx
+++ b/apostila/Projeto Space for me3.docx
@@ -11938,6 +11938,7 @@
       <w:r>
         <w:rPr>
           <w:i/>
+          <w:noProof/>
         </w:rPr>
         <w:drawing>
           <wp:inline distT="0" distB="0" distL="0" distR="0" wp14:anchorId="3CDC6641" wp14:editId="6E4BA4ED">
@@ -12495,6 +12496,554 @@
             </a:graphic>
           </wp:inline>
         </w:drawing>
+      </w:r>
+    </w:p>
+    <w:p>
+      <w:pPr>
+        <w:rPr>
+          <w:noProof/>
+        </w:rPr>
+      </w:pPr>
+      <w:r>
+        <w:rPr>
+          <w:noProof/>
+        </w:rPr>
+        <w:t>91-</w:t>
+      </w:r>
+      <w:r>
+        <w:rPr>
+          <w:noProof/>
+        </w:rPr>
+        <w:t xml:space="preserve"> Para colocar o texto ao lado da imagem utilizamos uma tecnica de flutuação float, quando utilizamos esse recurso, o elemento descola da página o que esta em baixo para cima, se  atentando a sua sombra, continua ocupando virtualmente o espaço.</w:t>
+      </w:r>
+    </w:p>
+    <w:p>
+      <w:pPr>
+        <w:rPr>
+          <w:noProof/>
+        </w:rPr>
+      </w:pPr>
+      <w:r>
+        <w:rPr>
+          <w:noProof/>
+        </w:rPr>
+        <w:drawing>
+          <wp:inline distT="0" distB="0" distL="0" distR="0" wp14:anchorId="355BA7CD" wp14:editId="184127CF">
+            <wp:extent cx="1428949" cy="733527"/>
+            <wp:effectExtent l="0" t="0" r="0" b="9525"/>
+            <wp:docPr id="185" name="Imagem 185"/>
+            <wp:cNvGraphicFramePr>
+              <a:graphicFrameLocks xmlns:a="http://schemas.openxmlformats.org/drawingml/2006/main" noChangeAspect="1"/>
+            </wp:cNvGraphicFramePr>
+            <a:graphic xmlns:a="http://schemas.openxmlformats.org/drawingml/2006/main">
+              <a:graphicData uri="http://schemas.openxmlformats.org/drawingml/2006/picture">
+                <pic:pic xmlns:pic="http://schemas.openxmlformats.org/drawingml/2006/picture">
+                  <pic:nvPicPr>
+                    <pic:cNvPr id="1" name=""/>
+                    <pic:cNvPicPr/>
+                  </pic:nvPicPr>
+                  <pic:blipFill>
+                    <a:blip r:embed="rId151"/>
+                    <a:stretch>
+                      <a:fillRect/>
+                    </a:stretch>
+                  </pic:blipFill>
+                  <pic:spPr>
+                    <a:xfrm>
+                      <a:off x="0" y="0"/>
+                      <a:ext cx="1428949" cy="733527"/>
+                    </a:xfrm>
+                    <a:prstGeom prst="rect">
+                      <a:avLst/>
+                    </a:prstGeom>
+                  </pic:spPr>
+                </pic:pic>
+              </a:graphicData>
+            </a:graphic>
+          </wp:inline>
+        </w:drawing>
+      </w:r>
+    </w:p>
+    <w:p>
+      <w:pPr>
+        <w:rPr>
+          <w:noProof/>
+        </w:rPr>
+      </w:pPr>
+      <w:r>
+        <w:rPr>
+          <w:noProof/>
+        </w:rPr>
+        <w:t>92- Observamos que ao utilizar o float o elemento a b</w:t>
+      </w:r>
+      <w:r>
+        <w:rPr>
+          <w:noProof/>
+        </w:rPr>
+        <w:t>aixo subiu para voltar ao estão anterior utilizamos o clear: left</w:t>
+      </w:r>
+    </w:p>
+    <w:p>
+      <w:pPr>
+        <w:rPr>
+          <w:noProof/>
+        </w:rPr>
+      </w:pPr>
+      <w:r>
+        <w:rPr>
+          <w:noProof/>
+        </w:rPr>
+        <mc:AlternateContent>
+          <mc:Choice Requires="wps">
+            <w:drawing>
+              <wp:anchor distT="0" distB="0" distL="114300" distR="114300" simplePos="0" relativeHeight="251704320" behindDoc="0" locked="0" layoutInCell="1" allowOverlap="1" wp14:anchorId="306F6E8E" wp14:editId="20F9CE2B">
+                <wp:simplePos x="0" y="0"/>
+                <wp:positionH relativeFrom="column">
+                  <wp:posOffset>1123950</wp:posOffset>
+                </wp:positionH>
+                <wp:positionV relativeFrom="paragraph">
+                  <wp:posOffset>307340</wp:posOffset>
+                </wp:positionV>
+                <wp:extent cx="1190625" cy="552450"/>
+                <wp:effectExtent l="38100" t="0" r="28575" b="57150"/>
+                <wp:wrapNone/>
+                <wp:docPr id="187" name="Conector de Seta Reta 187"/>
+                <wp:cNvGraphicFramePr/>
+                <a:graphic xmlns:a="http://schemas.openxmlformats.org/drawingml/2006/main">
+                  <a:graphicData uri="http://schemas.microsoft.com/office/word/2010/wordprocessingShape">
+                    <wps:wsp>
+                      <wps:cNvCnPr/>
+                      <wps:spPr>
+                        <a:xfrm flipH="1">
+                          <a:off x="0" y="0"/>
+                          <a:ext cx="1190625" cy="552450"/>
+                        </a:xfrm>
+                        <a:prstGeom prst="straightConnector1">
+                          <a:avLst/>
+                        </a:prstGeom>
+                        <a:ln>
+                          <a:tailEnd type="triangle"/>
+                        </a:ln>
+                      </wps:spPr>
+                      <wps:style>
+                        <a:lnRef idx="1">
+                          <a:schemeClr val="accent1"/>
+                        </a:lnRef>
+                        <a:fillRef idx="0">
+                          <a:schemeClr val="accent1"/>
+                        </a:fillRef>
+                        <a:effectRef idx="0">
+                          <a:schemeClr val="accent1"/>
+                        </a:effectRef>
+                        <a:fontRef idx="minor">
+                          <a:schemeClr val="tx1"/>
+                        </a:fontRef>
+                      </wps:style>
+                      <wps:bodyPr/>
+                    </wps:wsp>
+                  </a:graphicData>
+                </a:graphic>
+              </wp:anchor>
+            </w:drawing>
+          </mc:Choice>
+          <mc:Fallback>
+            <w:pict>
+              <v:shapetype w14:anchorId="024FCE42" id="_x0000_t32" coordsize="21600,21600" o:spt="32" o:oned="t" path="m,l21600,21600e" filled="f">
+                <v:path arrowok="t" fillok="f" o:connecttype="none"/>
+                <o:lock v:ext="edit" shapetype="t"/>
+              </v:shapetype>
+              <v:shape id="Conector de Seta Reta 187" o:spid="_x0000_s1026" type="#_x0000_t32" style="position:absolute;margin-left:88.5pt;margin-top:24.2pt;width:93.75pt;height:43.5pt;flip:x;z-index:251704320;visibility:visible;mso-wrap-style:square;mso-wrap-distance-left:9pt;mso-wrap-distance-top:0;mso-wrap-distance-right:9pt;mso-wrap-distance-bottom:0;mso-position-horizontal:absolute;mso-position-horizontal-relative:text;mso-position-vertical:absolute;mso-position-vertical-relative:text" o:gfxdata="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" strokecolor="#4472c4 [3204]" strokeweight=".5pt">
+                <v:stroke endarrow="block" joinstyle="miter"/>
+              </v:shape>
+            </w:pict>
+          </mc:Fallback>
+        </mc:AlternateContent>
+      </w:r>
+      <w:r>
+        <w:rPr>
+          <w:noProof/>
+        </w:rPr>
+        <w:drawing>
+          <wp:inline distT="0" distB="0" distL="0" distR="0" wp14:anchorId="7E338913" wp14:editId="1A1E93C4">
+            <wp:extent cx="1743318" cy="1152686"/>
+            <wp:effectExtent l="0" t="0" r="9525" b="9525"/>
+            <wp:docPr id="186" name="Imagem 186"/>
+            <wp:cNvGraphicFramePr>
+              <a:graphicFrameLocks xmlns:a="http://schemas.openxmlformats.org/drawingml/2006/main" noChangeAspect="1"/>
+            </wp:cNvGraphicFramePr>
+            <a:graphic xmlns:a="http://schemas.openxmlformats.org/drawingml/2006/main">
+              <a:graphicData uri="http://schemas.openxmlformats.org/drawingml/2006/picture">
+                <pic:pic xmlns:pic="http://schemas.openxmlformats.org/drawingml/2006/picture">
+                  <pic:nvPicPr>
+                    <pic:cNvPr id="1" name=""/>
+                    <pic:cNvPicPr/>
+                  </pic:nvPicPr>
+                  <pic:blipFill>
+                    <a:blip r:embed="rId152"/>
+                    <a:stretch>
+                      <a:fillRect/>
+                    </a:stretch>
+                  </pic:blipFill>
+                  <pic:spPr>
+                    <a:xfrm>
+                      <a:off x="0" y="0"/>
+                      <a:ext cx="1743318" cy="1152686"/>
+                    </a:xfrm>
+                    <a:prstGeom prst="rect">
+                      <a:avLst/>
+                    </a:prstGeom>
+                  </pic:spPr>
+                </pic:pic>
+              </a:graphicData>
+            </a:graphic>
+          </wp:inline>
+        </w:drawing>
+      </w:r>
+    </w:p>
+    <w:p>
+      <w:pPr>
+        <w:rPr>
+          <w:noProof/>
+        </w:rPr>
+      </w:pPr>
+      <w:r>
+        <w:rPr>
+          <w:noProof/>
+        </w:rPr>
+        <w:t>93- O texto estava muito colado com a imagem, inserimos uma distancia externa de 20px para a direita e 20px para baixo.</w:t>
+      </w:r>
+    </w:p>
+    <w:p>
+      <w:pPr>
+        <w:rPr>
+          <w:noProof/>
+        </w:rPr>
+      </w:pPr>
+      <w:r>
+        <w:rPr>
+          <w:noProof/>
+        </w:rPr>
+        <w:drawing>
+          <wp:inline distT="0" distB="0" distL="0" distR="0" wp14:anchorId="141DBD7B" wp14:editId="53FAD4C0">
+            <wp:extent cx="1876687" cy="876422"/>
+            <wp:effectExtent l="0" t="0" r="9525" b="0"/>
+            <wp:docPr id="188" name="Imagem 188"/>
+            <wp:cNvGraphicFramePr>
+              <a:graphicFrameLocks xmlns:a="http://schemas.openxmlformats.org/drawingml/2006/main" noChangeAspect="1"/>
+            </wp:cNvGraphicFramePr>
+            <a:graphic xmlns:a="http://schemas.openxmlformats.org/drawingml/2006/main">
+              <a:graphicData uri="http://schemas.openxmlformats.org/drawingml/2006/picture">
+                <pic:pic xmlns:pic="http://schemas.openxmlformats.org/drawingml/2006/picture">
+                  <pic:nvPicPr>
+                    <pic:cNvPr id="1" name=""/>
+                    <pic:cNvPicPr/>
+                  </pic:nvPicPr>
+                  <pic:blipFill>
+                    <a:blip r:embed="rId153"/>
+                    <a:stretch>
+                      <a:fillRect/>
+                    </a:stretch>
+                  </pic:blipFill>
+                  <pic:spPr>
+                    <a:xfrm>
+                      <a:off x="0" y="0"/>
+                      <a:ext cx="1876687" cy="876422"/>
+                    </a:xfrm>
+                    <a:prstGeom prst="rect">
+                      <a:avLst/>
+                    </a:prstGeom>
+                  </pic:spPr>
+                </pic:pic>
+              </a:graphicData>
+            </a:graphic>
+          </wp:inline>
+        </w:drawing>
+      </w:r>
+      <w:r>
+        <w:rPr>
+          <w:noProof/>
+        </w:rPr>
+        <w:drawing>
+          <wp:inline distT="0" distB="0" distL="0" distR="0" wp14:anchorId="23CAC7B3" wp14:editId="187A80F4">
+            <wp:extent cx="3333751" cy="917653"/>
+            <wp:effectExtent l="0" t="0" r="0" b="0"/>
+            <wp:docPr id="189" name="Imagem 189"/>
+            <wp:cNvGraphicFramePr>
+              <a:graphicFrameLocks xmlns:a="http://schemas.openxmlformats.org/drawingml/2006/main" noChangeAspect="1"/>
+            </wp:cNvGraphicFramePr>
+            <a:graphic xmlns:a="http://schemas.openxmlformats.org/drawingml/2006/main">
+              <a:graphicData uri="http://schemas.openxmlformats.org/drawingml/2006/picture">
+                <pic:pic xmlns:pic="http://schemas.openxmlformats.org/drawingml/2006/picture">
+                  <pic:nvPicPr>
+                    <pic:cNvPr id="1" name=""/>
+                    <pic:cNvPicPr/>
+                  </pic:nvPicPr>
+                  <pic:blipFill>
+                    <a:blip r:embed="rId154"/>
+                    <a:stretch>
+                      <a:fillRect/>
+                    </a:stretch>
+                  </pic:blipFill>
+                  <pic:spPr>
+                    <a:xfrm>
+                      <a:off x="0" y="0"/>
+                      <a:ext cx="3533331" cy="972590"/>
+                    </a:xfrm>
+                    <a:prstGeom prst="rect">
+                      <a:avLst/>
+                    </a:prstGeom>
+                  </pic:spPr>
+                </pic:pic>
+              </a:graphicData>
+            </a:graphic>
+          </wp:inline>
+        </w:drawing>
+      </w:r>
+    </w:p>
+    <w:p>
+      <w:pPr>
+        <w:rPr>
+          <w:noProof/>
+        </w:rPr>
+      </w:pPr>
+      <w:r>
+        <w:rPr>
+          <w:noProof/>
+        </w:rPr>
+        <w:t xml:space="preserve">94- Trabalhamos com fontes da internet </w:t>
+      </w:r>
+      <w:r>
+        <w:rPr>
+          <w:noProof/>
+        </w:rPr>
+        <w:t>vamos escolher um fonte para o nosso site que seja preparado pela internet.</w:t>
+      </w:r>
+    </w:p>
+    <w:p>
+      <w:pPr>
+        <w:rPr>
+          <w:noProof/>
+        </w:rPr>
+      </w:pPr>
+      <w:r>
+        <w:rPr>
+          <w:noProof/>
+        </w:rPr>
+        <w:t>Qual a diferença ser preparado ou não para internet é que a fonte independente do navegador vai se comporta da mesma forma.</w:t>
+      </w:r>
+    </w:p>
+    <w:p>
+      <w:pPr>
+        <w:rPr>
+          <w:noProof/>
+        </w:rPr>
+      </w:pPr>
+      <w:r>
+        <w:rPr>
+          <w:noProof/>
+        </w:rPr>
+        <w:t xml:space="preserve">Entra no site : </w:t>
+      </w:r>
+      <w:hyperlink r:id="rId155" w:history="1">
+        <w:r>
+          <w:rPr>
+            <w:rStyle w:val="Hyperlink"/>
+            <w:noProof/>
+          </w:rPr>
+          <w:t>https://fon</w:t>
+        </w:r>
+        <w:r>
+          <w:rPr>
+            <w:rStyle w:val="Hyperlink"/>
+            <w:noProof/>
+          </w:rPr>
+          <w:t>t</w:t>
+        </w:r>
+        <w:r>
+          <w:rPr>
+            <w:rStyle w:val="Hyperlink"/>
+            <w:noProof/>
+          </w:rPr>
+          <w:t>s</w:t>
+        </w:r>
+        <w:r>
+          <w:rPr>
+            <w:rStyle w:val="Hyperlink"/>
+            <w:noProof/>
+          </w:rPr>
+          <w:t>.</w:t>
+        </w:r>
+        <w:r>
+          <w:rPr>
+            <w:rStyle w:val="Hyperlink"/>
+            <w:noProof/>
+          </w:rPr>
+          <w:t>g</w:t>
+        </w:r>
+        <w:r>
+          <w:rPr>
+            <w:rStyle w:val="Hyperlink"/>
+            <w:noProof/>
+          </w:rPr>
+          <w:t>o</w:t>
+        </w:r>
+        <w:r>
+          <w:rPr>
+            <w:rStyle w:val="Hyperlink"/>
+            <w:noProof/>
+          </w:rPr>
+          <w:t>ogle.com</w:t>
+        </w:r>
+      </w:hyperlink>
+      <w:r>
+        <w:rPr>
+          <w:noProof/>
+        </w:rPr>
+        <w:t xml:space="preserve">  </w:t>
+      </w:r>
+      <w:r>
+        <w:rPr>
+          <w:noProof/>
+        </w:rPr>
+        <w:t>para escolher a fonte que desejamos e copiamos o  código que é gerado para colar no html e no css.</w:t>
+      </w:r>
+    </w:p>
+    <w:p>
+      <w:pPr>
+        <w:rPr>
+          <w:noProof/>
+        </w:rPr>
+      </w:pPr>
+      <w:r>
+        <w:rPr>
+          <w:noProof/>
+        </w:rPr>
+        <w:t>Lembrando que no html precisamos colar dentro do head e no css colocamos a onde queremos aplicar a fonte.</w:t>
+      </w:r>
+    </w:p>
+    <w:p>
+      <w:pPr>
+        <w:rPr>
+          <w:noProof/>
+        </w:rPr>
+      </w:pPr>
+      <w:r>
+        <w:rPr>
+          <w:noProof/>
+        </w:rPr>
+        <w:drawing>
+          <wp:inline distT="0" distB="0" distL="0" distR="0" wp14:anchorId="7F21E96D" wp14:editId="4DF46578">
+            <wp:extent cx="4273521" cy="1876983"/>
+            <wp:effectExtent l="0" t="0" r="0" b="9525"/>
+            <wp:docPr id="190" name="Imagem 190"/>
+            <wp:cNvGraphicFramePr>
+              <a:graphicFrameLocks xmlns:a="http://schemas.openxmlformats.org/drawingml/2006/main" noChangeAspect="1"/>
+            </wp:cNvGraphicFramePr>
+            <a:graphic xmlns:a="http://schemas.openxmlformats.org/drawingml/2006/main">
+              <a:graphicData uri="http://schemas.openxmlformats.org/drawingml/2006/picture">
+                <pic:pic xmlns:pic="http://schemas.openxmlformats.org/drawingml/2006/picture">
+                  <pic:nvPicPr>
+                    <pic:cNvPr id="1" name=""/>
+                    <pic:cNvPicPr/>
+                  </pic:nvPicPr>
+                  <pic:blipFill>
+                    <a:blip r:embed="rId156"/>
+                    <a:stretch>
+                      <a:fillRect/>
+                    </a:stretch>
+                  </pic:blipFill>
+                  <pic:spPr>
+                    <a:xfrm>
+                      <a:off x="0" y="0"/>
+                      <a:ext cx="4370501" cy="1919578"/>
+                    </a:xfrm>
+                    <a:prstGeom prst="rect">
+                      <a:avLst/>
+                    </a:prstGeom>
+                  </pic:spPr>
+                </pic:pic>
+              </a:graphicData>
+            </a:graphic>
+          </wp:inline>
+        </w:drawing>
+      </w:r>
+    </w:p>
+    <w:p>
+      <w:pPr>
+        <w:rPr>
+          <w:noProof/>
+        </w:rPr>
+      </w:pPr>
+      <w:r>
+        <w:rPr>
+          <w:noProof/>
+        </w:rPr>
+        <w:t>95-</w:t>
+      </w:r>
+      <w:r>
+        <w:rPr>
+          <w:noProof/>
+        </w:rPr>
+        <w:t xml:space="preserve"> Para inserir o mapa no site acessamos </w:t>
+      </w:r>
+      <w:r>
+        <w:rPr>
+          <w:noProof/>
+        </w:rPr>
+        <w:t>o google maps na pesquisa digitamos o estabelecimentos desejado no nosso caso Barbearia Space For Men, no campo parecido 3 pontinhos ou três linhas clica vau aparecer a seguinte tela com o campo compatilhar ou incorporar esse campo e copiamos o link que gera para colocar no html.</w:t>
+      </w:r>
+    </w:p>
+    <w:p>
+      <w:pPr>
+        <w:rPr>
+          <w:noProof/>
+        </w:rPr>
+      </w:pPr>
+      <w:r>
+        <w:rPr>
+          <w:noProof/>
+        </w:rPr>
+        <w:drawing>
+          <wp:inline distT="0" distB="0" distL="0" distR="0" wp14:anchorId="521A56CA" wp14:editId="7F24D185">
+            <wp:extent cx="5038725" cy="2582572"/>
+            <wp:effectExtent l="0" t="0" r="0" b="8255"/>
+            <wp:docPr id="191" name="Imagem 191"/>
+            <wp:cNvGraphicFramePr>
+              <a:graphicFrameLocks xmlns:a="http://schemas.openxmlformats.org/drawingml/2006/main" noChangeAspect="1"/>
+            </wp:cNvGraphicFramePr>
+            <a:graphic xmlns:a="http://schemas.openxmlformats.org/drawingml/2006/main">
+              <a:graphicData uri="http://schemas.openxmlformats.org/drawingml/2006/picture">
+                <pic:pic xmlns:pic="http://schemas.openxmlformats.org/drawingml/2006/picture">
+                  <pic:nvPicPr>
+                    <pic:cNvPr id="1" name=""/>
+                    <pic:cNvPicPr/>
+                  </pic:nvPicPr>
+                  <pic:blipFill>
+                    <a:blip r:embed="rId157"/>
+                    <a:stretch>
+                      <a:fillRect/>
+                    </a:stretch>
+                  </pic:blipFill>
+                  <pic:spPr>
+                    <a:xfrm>
+                      <a:off x="0" y="0"/>
+                      <a:ext cx="5045713" cy="2586154"/>
+                    </a:xfrm>
+                    <a:prstGeom prst="rect">
+                      <a:avLst/>
+                    </a:prstGeom>
+                  </pic:spPr>
+                </pic:pic>
+              </a:graphicData>
+            </a:graphic>
+          </wp:inline>
+        </w:drawing>
+      </w:r>
+      <w:r>
+        <w:rPr>
+          <w:noProof/>
+        </w:rPr>
+        <w:t xml:space="preserve">  </w:t>
       </w:r>
       <w:bookmarkStart w:id="0" w:name="_GoBack"/>
       <w:bookmarkEnd w:id="0"/>
@@ -13263,6 +13812,7 @@
   <w:style w:type="character" w:default="1" w:styleId="Fontepargpadro">
     <w:name w:val="Default Paragraph Font"/>
     <w:uiPriority w:val="1"/>
+    <w:semiHidden/>
     <w:unhideWhenUsed/>
   </w:style>
   <w:style w:type="table" w:default="1" w:styleId="Tabelanormal">
@@ -13318,6 +13868,18 @@
     <w:rPr>
       <w:color w:val="605E5C"/>
       <w:shd w:val="clear" w:color="auto" w:fill="E1DFDD"/>
+    </w:rPr>
+  </w:style>
+  <w:style w:type="character" w:styleId="HiperlinkVisitado">
+    <w:name w:val="FollowedHyperlink"/>
+    <w:basedOn w:val="Fontepargpadro"/>
+    <w:uiPriority w:val="99"/>
+    <w:semiHidden/>
+    <w:unhideWhenUsed/>
+    <w:rsid w:val="005768F3"/>
+    <w:rPr>
+      <w:color w:val="954F72" w:themeColor="followedHyperlink"/>
+      <w:u w:val="single"/>
     </w:rPr>
   </w:style>
 </w:styles>
@@ -13916,7 +14478,7 @@
 </file>
 
 <file path=customXml/itemProps4.xml><?xml version="1.0" encoding="utf-8"?>
-<ds:datastoreItem xmlns:ds="http://schemas.openxmlformats.org/officeDocument/2006/customXml" ds:itemID="{07F4F0C0-8EA2-4ABF-89F4-3D6773A7F1EF}">
+<ds:datastoreItem xmlns:ds="http://schemas.openxmlformats.org/officeDocument/2006/customXml" ds:itemID="{C9E3B9EB-88C8-4605-AE7E-8BF1C4A9DAA4}">
   <ds:schemaRefs>
     <ds:schemaRef ds:uri="http://schemas.openxmlformats.org/officeDocument/2006/bibliography"/>
   </ds:schemaRefs>

</xml_diff>